<commit_message>
legal: update Access Control Policy §4.1 — MFA now implemented
Reflects Patet migration 023 + lib/mfa.ts shipping today. TOTP MFA is
no longer "on roadmap" — it's enforced as a hard gate before Plaid
Link is surfaced to consumers. Doc 10 §4.1 rewritten to describe the
actual code path (otpauth pairing, 10 recovery codes, 5-min step-up
window, 403 mfa_required vs mfa_step_up_required error codes).

Regenerated 10_Access_Control_Policy.docx to match.

Co-Authored-By: Claude Opus 4.7 (1M context) <noreply@anthropic.com>
</commit_message>
<xml_diff>
--- a/legal/10_Access_Control_Policy.docx
+++ b/legal/10_Access_Control_Policy.docx
@@ -1637,7 +1637,7 @@
           <w:b w:val="0"/>
           <w:sz w:val="22"/>
         </w:rPr>
-        <w:t xml:space="preserve"> On the active roadmap (audit defer-item L10). MFA will be </w:t>
+        <w:t xml:space="preserve"> TOTP MFA is implemented (Patet migration 023, server module `server/src/lib/mfa.ts`). Authenticator-app pairing (Google Authenticator / Authy / 1Password) follows the otpauth standard (RFC 6238). 10 one-time recovery codes are generated at pairing time. </w:t>
       </w:r>
       <w:r>
         <w:rPr>
@@ -1645,7 +1645,7 @@
           <w:b/>
           <w:sz w:val="22"/>
         </w:rPr>
-        <w:t>required</w:t>
+        <w:t>MFA is enforced as a hard gate before Plaid Link is surfaced</w:t>
       </w:r>
       <w:r>
         <w:rPr>
@@ -1653,7 +1653,7 @@
           <w:b w:val="0"/>
           <w:sz w:val="22"/>
         </w:rPr>
-        <w:t xml:space="preserve"> before connecting a Plaid bank account on any consumer product that integrates Plaid. The phased rollout is: (a) TOTP MFA available as opt-in for all users (target Q3 2026); (b) MFA mandatory for accounts with a connected Plaid item (target before commercial Patet launch); (c) MFA mandatory for any account with `role='admin'` or `role='support'` (already enforced today via the operational reality that there is exactly one such account, behind the Managing Member's hardware-key-protected primary identity).</w:t>
+        <w:t>: the `POST /api/plaid/link-token` endpoint returns `403 mfa_required` when no MFA record exists and `403 mfa_step_up_required` when MFA is enabled but the most recent challenge is older than 5 minutes. The mobile/web client routes the user to either `/mfa/setup` or `/mfa/challenge` accordingly and replays Plaid Link after success. The same step-up primitive backs future per-feature requirements (e.g., changing email, account deletion). The Managing Member identity is also protected by hardware-key (FIDO2/WebAuthn) MFA on every vendor console (GCP, Render, Neon, Vercel, GitHub, Apple Developer, App Store Connect, Google Play, RevenueCat) — this is the second-factor surface for any identity holding `role='admin'` or `role='support'`.</w:t>
       </w:r>
     </w:p>
     <w:p>

</xml_diff>